<commit_message>
Fix Word export templates
</commit_message>
<xml_diff>
--- a/assets/templates/word/business_registration/2. Điều lệ Công ty.docx
+++ b/assets/templates/word/business_registration/2. Điều lệ Công ty.docx
@@ -107,54 +107,11 @@
           <w:lang w:val="vi-VN" w:eastAsia="zh-CN"/>
         </w:rPr>
       </w:pPr>
-      <w:r>
-        <w:rPr>
-          <w:rFonts w:eastAsia="Times New Roman"/>
-          <w:b/>
-          <w:bCs/>
-          <w:color w:val="000000"/>
-          <w:sz w:val="26"/>
-          <w:szCs w:val="26"/>
-          <w:lang w:val="vi-VN" w:eastAsia="zh-CN"/>
-        </w:rPr>
-        <w:t>[</w:t>
-      </w:r>
-      <w:r>
-        <w:rPr>
-          <w:rFonts w:eastAsia="Times New Roman"/>
-          <w:b/>
-          <w:bCs/>
-          <w:color w:val="000000"/>
-          <w:sz w:val="26"/>
-          <w:szCs w:val="26"/>
-          <w:lang w:eastAsia="zh-CN"/>
-        </w:rPr>
-        <w:t>CÔNG</w:t>
-      </w:r>
-      <w:r>
-        <w:rPr>
-          <w:rFonts w:eastAsia="Times New Roman"/>
-          <w:b/>
-          <w:bCs/>
-          <w:color w:val="000000"/>
-          <w:sz w:val="26"/>
-          <w:szCs w:val="26"/>
-          <w:lang w:val="vi-VN" w:eastAsia="zh-CN"/>
-        </w:rPr>
-        <w:t xml:space="preserve"> TY TNHH THƯƠNG MẠI VÀ DỊCH VỤ </w:t>
-      </w:r>
-      <w:r>
-        <w:rPr>
-          <w:rFonts w:eastAsia="Times New Roman"/>
-          <w:b/>
-          <w:bCs/>
-          <w:color w:val="000000"/>
-          <w:sz w:val="26"/>
-          <w:szCs w:val="26"/>
-          <w:lang w:val="vi-VN" w:eastAsia="zh-CN"/>
-        </w:rPr>
-        <w:t>EDITON]</w:t>
-      </w:r>
+      <w:bookmarkStart w:id="31000" w:name="MINGO_FIELD_0"/>
+      <w:r>
+        <w:t xml:space="preserve">CÔNG TY TNHH THƯƠNG MẠI VÀ DỊCH VỤ EDITON</w:t>
+      </w:r>
+      <w:bookmarkEnd w:id="31000"/>
     </w:p>
     <w:p>
       <w:pPr>
@@ -509,253 +466,14 @@
           <w:lang w:eastAsia="zh-CN"/>
         </w:rPr>
       </w:pPr>
-      <w:bookmarkStart w:id="0" w:name="_Hlk169099485"/>
-      <w:bookmarkStart w:id="1" w:name="_Hlk201563569"/>
-      <w:r>
-        <w:rPr>
-          <w:rFonts w:eastAsia="Times New Roman"/>
-          <w:color w:val="000000"/>
-          <w:sz w:val="25"/>
-          <w:szCs w:val="25"/>
-          <w:lang w:eastAsia="zh-CN"/>
-        </w:rPr>
+      <w:r>
         <w:t xml:space="preserve">Tên công ty viết bằng tiếng Việt: </w:t>
       </w:r>
-      <w:r>
-        <w:rPr>
-          <w:rFonts w:eastAsia="Times New Roman"/>
-          <w:color w:val="000000"/>
-          <w:sz w:val="25"/>
-          <w:szCs w:val="25"/>
-          <w:lang w:val="vi-VN" w:eastAsia="zh-CN"/>
-        </w:rPr>
-        <w:t>[</w:t>
-      </w:r>
-      <w:r>
-        <w:rPr>
-          <w:rFonts w:eastAsia="Times New Roman"/>
-          <w:b/>
-          <w:bCs/>
-          <w:color w:val="000000"/>
-          <w:sz w:val="26"/>
-          <w:szCs w:val="26"/>
-          <w:highlight w:val="yellow"/>
-          <w:lang w:eastAsia="zh-CN"/>
-        </w:rPr>
-        <w:t>CÔNG</w:t>
-      </w:r>
-      <w:r>
-        <w:rPr>
-          <w:rFonts w:eastAsia="Times New Roman"/>
-          <w:b/>
-          <w:bCs/>
-          <w:color w:val="000000"/>
-          <w:sz w:val="26"/>
-          <w:szCs w:val="26"/>
-          <w:lang w:val="vi-VN" w:eastAsia="zh-CN"/>
-        </w:rPr>
-        <w:t xml:space="preserve"> </w:t>
-      </w:r>
-      <w:r>
-        <w:rPr>
-          <w:rFonts w:eastAsia="Times New Roman"/>
-          <w:b/>
-          <w:bCs/>
-          <w:color w:val="000000"/>
-          <w:sz w:val="26"/>
-          <w:szCs w:val="26"/>
-          <w:highlight w:val="yellow"/>
-          <w:lang w:val="vi-VN" w:eastAsia="zh-CN"/>
-        </w:rPr>
-        <w:t>TY</w:t>
-      </w:r>
-      <w:r>
-        <w:rPr>
-          <w:rFonts w:eastAsia="Times New Roman"/>
-          <w:b/>
-          <w:bCs/>
-          <w:color w:val="000000"/>
-          <w:sz w:val="26"/>
-          <w:szCs w:val="26"/>
-          <w:lang w:val="vi-VN" w:eastAsia="zh-CN"/>
-        </w:rPr>
-        <w:t xml:space="preserve"> </w:t>
-      </w:r>
-      <w:r>
-        <w:rPr>
-          <w:rFonts w:eastAsia="Times New Roman"/>
-          <w:b/>
-          <w:bCs/>
-          <w:color w:val="000000"/>
-          <w:sz w:val="26"/>
-          <w:szCs w:val="26"/>
-          <w:highlight w:val="yellow"/>
-          <w:lang w:val="vi-VN" w:eastAsia="zh-CN"/>
-        </w:rPr>
-        <w:t>TNHH</w:t>
-      </w:r>
-      <w:r>
-        <w:rPr>
-          <w:rFonts w:eastAsia="Times New Roman"/>
-          <w:b/>
-          <w:bCs/>
-          <w:color w:val="000000"/>
-          <w:sz w:val="26"/>
-          <w:szCs w:val="26"/>
-          <w:lang w:val="vi-VN" w:eastAsia="zh-CN"/>
-        </w:rPr>
-        <w:t xml:space="preserve"> </w:t>
-      </w:r>
-      <w:r>
-        <w:rPr>
-          <w:rFonts w:eastAsia="Times New Roman"/>
-          <w:b/>
-          <w:bCs/>
-          <w:color w:val="000000"/>
-          <w:sz w:val="26"/>
-          <w:szCs w:val="26"/>
-          <w:highlight w:val="yellow"/>
-          <w:lang w:val="vi-VN" w:eastAsia="zh-CN"/>
-        </w:rPr>
-        <w:t>THƯƠNG</w:t>
-      </w:r>
-      <w:r>
-        <w:rPr>
-          <w:rFonts w:eastAsia="Times New Roman"/>
-          <w:b/>
-          <w:bCs/>
-          <w:color w:val="000000"/>
-          <w:sz w:val="26"/>
-          <w:szCs w:val="26"/>
-          <w:lang w:val="vi-VN" w:eastAsia="zh-CN"/>
-        </w:rPr>
-        <w:t xml:space="preserve"> </w:t>
-      </w:r>
-      <w:r>
-        <w:rPr>
-          <w:rFonts w:eastAsia="Times New Roman"/>
-          <w:b/>
-          <w:bCs/>
-          <w:color w:val="000000"/>
-          <w:sz w:val="26"/>
-          <w:szCs w:val="26"/>
-          <w:highlight w:val="yellow"/>
-          <w:lang w:val="vi-VN" w:eastAsia="zh-CN"/>
-        </w:rPr>
-        <w:t>MẠI</w:t>
-      </w:r>
-      <w:r>
-        <w:rPr>
-          <w:rFonts w:eastAsia="Times New Roman"/>
-          <w:b/>
-          <w:bCs/>
-          <w:color w:val="000000"/>
-          <w:sz w:val="26"/>
-          <w:szCs w:val="26"/>
-          <w:lang w:val="vi-VN" w:eastAsia="zh-CN"/>
-        </w:rPr>
-        <w:t xml:space="preserve"> </w:t>
-      </w:r>
-      <w:r>
-        <w:rPr>
-          <w:rFonts w:eastAsia="Times New Roman"/>
-          <w:b/>
-          <w:bCs/>
-          <w:color w:val="000000"/>
-          <w:sz w:val="26"/>
-          <w:szCs w:val="26"/>
-          <w:highlight w:val="yellow"/>
-          <w:lang w:val="vi-VN" w:eastAsia="zh-CN"/>
-        </w:rPr>
-        <w:t>VÀ</w:t>
-      </w:r>
-      <w:r>
-        <w:rPr>
-          <w:rFonts w:eastAsia="Times New Roman"/>
-          <w:b/>
-          <w:bCs/>
-          <w:color w:val="000000"/>
-          <w:sz w:val="26"/>
-          <w:szCs w:val="26"/>
-          <w:lang w:val="vi-VN" w:eastAsia="zh-CN"/>
-        </w:rPr>
-        <w:t xml:space="preserve"> </w:t>
-      </w:r>
-      <w:r>
-        <w:rPr>
-          <w:rFonts w:eastAsia="Times New Roman"/>
-          <w:b/>
-          <w:bCs/>
-          <w:color w:val="000000"/>
-          <w:sz w:val="26"/>
-          <w:szCs w:val="26"/>
-          <w:highlight w:val="yellow"/>
-          <w:lang w:val="vi-VN" w:eastAsia="zh-CN"/>
-        </w:rPr>
-        <w:t>DỊCH</w:t>
-      </w:r>
-      <w:r>
-        <w:rPr>
-          <w:rFonts w:eastAsia="Times New Roman"/>
-          <w:b/>
-          <w:bCs/>
-          <w:color w:val="000000"/>
-          <w:sz w:val="26"/>
-          <w:szCs w:val="26"/>
-          <w:lang w:val="vi-VN" w:eastAsia="zh-CN"/>
-        </w:rPr>
-        <w:t xml:space="preserve"> </w:t>
-      </w:r>
-      <w:r>
-        <w:rPr>
-          <w:rFonts w:eastAsia="Times New Roman"/>
-          <w:b/>
-          <w:bCs/>
-          <w:color w:val="000000"/>
-          <w:sz w:val="26"/>
-          <w:szCs w:val="26"/>
-          <w:highlight w:val="yellow"/>
-          <w:lang w:val="vi-VN" w:eastAsia="zh-CN"/>
-        </w:rPr>
-        <w:t>VỤ</w:t>
-      </w:r>
-      <w:r>
-        <w:rPr>
-          <w:rFonts w:eastAsia="Times New Roman"/>
-          <w:b/>
-          <w:bCs/>
-          <w:color w:val="000000"/>
-          <w:sz w:val="26"/>
-          <w:szCs w:val="26"/>
-          <w:lang w:val="vi-VN" w:eastAsia="zh-CN"/>
-        </w:rPr>
-        <w:t xml:space="preserve"> </w:t>
-      </w:r>
-      <w:r>
-        <w:rPr>
-          <w:rFonts w:eastAsia="Times New Roman"/>
-          <w:b/>
-          <w:bCs/>
-          <w:color w:val="000000"/>
-          <w:sz w:val="26"/>
-          <w:szCs w:val="26"/>
-          <w:highlight w:val="yellow"/>
-          <w:lang w:val="vi-VN" w:eastAsia="zh-CN"/>
-        </w:rPr>
-        <w:t>EDITION</w:t>
-      </w:r>
-      <w:r>
-        <w:rPr>
-          <w:rFonts w:eastAsia="Times New Roman"/>
-          <w:b/>
-          <w:bCs/>
-          <w:color w:val="000000"/>
-          <w:sz w:val="26"/>
-          <w:szCs w:val="26"/>
-          <w:lang w:val="vi-VN" w:eastAsia="zh-CN"/>
-        </w:rPr>
-        <w:t>]</w:t>
-      </w:r>
+      <w:bookmarkStart w:id="31001" w:name="MINGO_FIELD_1"/>
+      <w:r>
+        <w:t xml:space="preserve">CÔNG TY TNHH THƯƠNG MẠI VÀ DỊCH VỤ EDITION</w:t>
+      </w:r>
+      <w:bookmarkEnd w:id="31001"/>
     </w:p>
     <w:p>
       <w:pPr>
@@ -804,7 +522,7 @@
           <w:szCs w:val="25"/>
           <w:lang w:val="vi-VN" w:eastAsia="zh-CN"/>
         </w:rPr>
-        <w:t>[</w:t>
+        <w:t/>
       </w:r>
       <w:proofErr w:type="gramEnd"/>
       <w:r>
@@ -815,8 +533,13 @@
           <w:szCs w:val="25"/>
           <w:lang w:val="vi-VN" w:eastAsia="zh-CN"/>
         </w:rPr>
-        <w:t>]</w:t>
-      </w:r>
+        <w:t/>
+      </w:r>
+      <w:bookmarkStart w:id="32000" w:name="MINGO_FIELD_20"/>
+      <w:r>
+        <w:t xml:space="preserve"/>
+      </w:r>
+      <w:bookmarkEnd w:id="32000"/>
     </w:p>
     <w:p>
       <w:pPr>
@@ -867,8 +590,13 @@
           <w:szCs w:val="25"/>
           <w:lang w:val="vi-VN" w:eastAsia="zh-CN"/>
         </w:rPr>
-        <w:t>[]</w:t>
-      </w:r>
+        <w:t/>
+      </w:r>
+      <w:bookmarkStart w:id="32001" w:name="MINGO_FIELD_21"/>
+      <w:r>
+        <w:t xml:space="preserve"/>
+      </w:r>
+      <w:bookmarkEnd w:id="32001"/>
     </w:p>
     <w:p>
       <w:pPr>
@@ -885,242 +613,13 @@
         </w:rPr>
       </w:pPr>
       <w:r>
-        <w:rPr>
-          <w:color w:val="000000"/>
-          <w:sz w:val="25"/>
-          <w:szCs w:val="25"/>
-          <w:lang w:val="vi-VN"/>
-        </w:rPr>
-        <w:t xml:space="preserve">2.2. </w:t>
-      </w:r>
-      <w:r>
-        <w:rPr>
-          <w:color w:val="000000"/>
-          <w:sz w:val="25"/>
-          <w:szCs w:val="25"/>
-          <w:lang w:val="vi-VN"/>
-        </w:rPr>
-        <w:t xml:space="preserve">Trụ sở công ty: </w:t>
-      </w:r>
-      <w:r>
-        <w:rPr>
-          <w:color w:val="000000"/>
-          <w:sz w:val="25"/>
-          <w:szCs w:val="25"/>
-          <w:lang w:val="vi-VN"/>
-        </w:rPr>
-        <w:t>[</w:t>
-      </w:r>
-      <w:r>
-        <w:rPr>
-          <w:rFonts w:eastAsia="Times New Roman"/>
-          <w:color w:val="000000"/>
-          <w:sz w:val="26"/>
-          <w:szCs w:val="26"/>
-          <w:highlight w:val="yellow"/>
-          <w:lang w:val="vi-VN" w:eastAsia="zh-CN"/>
-        </w:rPr>
-        <w:t>Số</w:t>
-      </w:r>
-      <w:r>
-        <w:rPr>
-          <w:rFonts w:eastAsia="Times New Roman"/>
-          <w:color w:val="000000"/>
-          <w:sz w:val="26"/>
-          <w:szCs w:val="26"/>
-          <w:lang w:val="vi-VN" w:eastAsia="zh-CN"/>
-        </w:rPr>
-        <w:t xml:space="preserve"> </w:t>
-      </w:r>
-      <w:r>
-        <w:rPr>
-          <w:rFonts w:eastAsia="Times New Roman"/>
-          <w:color w:val="000000"/>
-          <w:sz w:val="26"/>
-          <w:szCs w:val="26"/>
-          <w:highlight w:val="yellow"/>
-          <w:lang w:val="vi-VN" w:eastAsia="zh-CN"/>
-        </w:rPr>
-        <w:t>nhà</w:t>
-      </w:r>
-      <w:r>
-        <w:rPr>
-          <w:rFonts w:eastAsia="Times New Roman"/>
-          <w:color w:val="000000"/>
-          <w:sz w:val="26"/>
-          <w:szCs w:val="26"/>
-          <w:lang w:val="vi-VN" w:eastAsia="zh-CN"/>
-        </w:rPr>
-        <w:t xml:space="preserve"> </w:t>
-      </w:r>
-      <w:r>
-        <w:rPr>
-          <w:rFonts w:eastAsia="Times New Roman"/>
-          <w:color w:val="000000"/>
-          <w:sz w:val="26"/>
-          <w:szCs w:val="26"/>
-          <w:highlight w:val="yellow"/>
-          <w:lang w:val="vi-VN" w:eastAsia="zh-CN"/>
-        </w:rPr>
-        <w:t>13</w:t>
-      </w:r>
-      <w:r>
-        <w:rPr>
-          <w:rFonts w:eastAsia="Times New Roman"/>
-          <w:color w:val="000000"/>
-          <w:sz w:val="26"/>
-          <w:szCs w:val="26"/>
-          <w:lang w:val="vi-VN" w:eastAsia="zh-CN"/>
-        </w:rPr>
-        <w:t xml:space="preserve">, </w:t>
-      </w:r>
-      <w:r>
-        <w:rPr>
-          <w:rFonts w:eastAsia="Times New Roman"/>
-          <w:color w:val="000000"/>
-          <w:sz w:val="26"/>
-          <w:szCs w:val="26"/>
-          <w:highlight w:val="yellow"/>
-          <w:lang w:val="vi-VN" w:eastAsia="zh-CN"/>
-        </w:rPr>
-        <w:t>Thôn</w:t>
-      </w:r>
-      <w:r>
-        <w:rPr>
-          <w:rFonts w:eastAsia="Times New Roman"/>
-          <w:color w:val="000000"/>
-          <w:sz w:val="26"/>
-          <w:szCs w:val="26"/>
-          <w:lang w:val="vi-VN" w:eastAsia="zh-CN"/>
-        </w:rPr>
-        <w:t xml:space="preserve"> </w:t>
-      </w:r>
-      <w:r>
-        <w:rPr>
-          <w:rFonts w:eastAsia="Times New Roman"/>
-          <w:color w:val="000000"/>
-          <w:sz w:val="26"/>
-          <w:szCs w:val="26"/>
-          <w:highlight w:val="yellow"/>
-          <w:lang w:val="vi-VN" w:eastAsia="zh-CN"/>
-        </w:rPr>
-        <w:t>4</w:t>
-      </w:r>
-      <w:r>
-        <w:rPr>
-          <w:rFonts w:eastAsia="Times New Roman"/>
-          <w:color w:val="000000"/>
-          <w:sz w:val="26"/>
-          <w:szCs w:val="26"/>
-          <w:lang w:val="vi-VN" w:eastAsia="zh-CN"/>
-        </w:rPr>
-        <w:t xml:space="preserve">, </w:t>
-      </w:r>
-      <w:r>
-        <w:rPr>
-          <w:rFonts w:eastAsia="Times New Roman"/>
-          <w:color w:val="000000"/>
-          <w:sz w:val="26"/>
-          <w:szCs w:val="26"/>
-          <w:highlight w:val="yellow"/>
-          <w:lang w:val="vi-VN" w:eastAsia="zh-CN"/>
-        </w:rPr>
-        <w:t>Xã</w:t>
-      </w:r>
-      <w:r>
-        <w:rPr>
-          <w:rFonts w:eastAsia="Times New Roman"/>
-          <w:color w:val="000000"/>
-          <w:sz w:val="26"/>
-          <w:szCs w:val="26"/>
-          <w:lang w:val="vi-VN" w:eastAsia="zh-CN"/>
-        </w:rPr>
-        <w:t xml:space="preserve"> </w:t>
-      </w:r>
-      <w:r>
-        <w:rPr>
-          <w:rFonts w:eastAsia="Times New Roman"/>
-          <w:color w:val="000000"/>
-          <w:sz w:val="26"/>
-          <w:szCs w:val="26"/>
-          <w:highlight w:val="yellow"/>
-          <w:lang w:val="vi-VN" w:eastAsia="zh-CN"/>
-        </w:rPr>
-        <w:t>Hòa</w:t>
-      </w:r>
-      <w:r>
-        <w:rPr>
-          <w:rFonts w:eastAsia="Times New Roman"/>
-          <w:color w:val="000000"/>
-          <w:sz w:val="26"/>
-          <w:szCs w:val="26"/>
-          <w:lang w:val="vi-VN" w:eastAsia="zh-CN"/>
-        </w:rPr>
-        <w:t xml:space="preserve"> </w:t>
-      </w:r>
-      <w:r>
-        <w:rPr>
-          <w:rFonts w:eastAsia="Times New Roman"/>
-          <w:color w:val="000000"/>
-          <w:sz w:val="26"/>
-          <w:szCs w:val="26"/>
-          <w:highlight w:val="yellow"/>
-          <w:lang w:val="vi-VN" w:eastAsia="zh-CN"/>
-        </w:rPr>
-        <w:t>Lạc</w:t>
-      </w:r>
-      <w:r>
-        <w:rPr>
-          <w:rFonts w:eastAsia="Times New Roman"/>
-          <w:color w:val="000000"/>
-          <w:sz w:val="26"/>
-          <w:szCs w:val="26"/>
-          <w:lang w:val="vi-VN" w:eastAsia="zh-CN"/>
-        </w:rPr>
-        <w:t xml:space="preserve">, </w:t>
-      </w:r>
-      <w:r>
-        <w:rPr>
-          <w:rFonts w:eastAsia="Times New Roman"/>
-          <w:color w:val="000000"/>
-          <w:sz w:val="26"/>
-          <w:szCs w:val="26"/>
-          <w:highlight w:val="yellow"/>
-          <w:lang w:val="vi-VN" w:eastAsia="zh-CN"/>
-        </w:rPr>
-        <w:t>Hà</w:t>
-      </w:r>
-      <w:r>
-        <w:rPr>
-          <w:rFonts w:eastAsia="Times New Roman"/>
-          <w:color w:val="000000"/>
-          <w:sz w:val="26"/>
-          <w:szCs w:val="26"/>
-          <w:lang w:val="vi-VN" w:eastAsia="zh-CN"/>
-        </w:rPr>
-        <w:t xml:space="preserve"> </w:t>
-      </w:r>
-      <w:r>
-        <w:rPr>
-          <w:rFonts w:eastAsia="Times New Roman"/>
-          <w:color w:val="000000"/>
-          <w:sz w:val="26"/>
-          <w:szCs w:val="26"/>
-          <w:highlight w:val="yellow"/>
-          <w:lang w:val="vi-VN" w:eastAsia="zh-CN"/>
-        </w:rPr>
-        <w:t>Nội</w:t>
-      </w:r>
-      <w:r>
-        <w:rPr>
-          <w:rFonts w:eastAsia="Times New Roman"/>
-          <w:color w:val="000000"/>
-          <w:sz w:val="26"/>
-          <w:szCs w:val="26"/>
-          <w:lang w:val="vi-VN" w:eastAsia="zh-CN"/>
-        </w:rPr>
-        <w:t xml:space="preserve"> ]</w:t>
-      </w:r>
+        <w:t xml:space="preserve">2.2. Trụ sở công ty: </w:t>
+      </w:r>
+      <w:bookmarkStart w:id="31002" w:name="MINGO_FIELD_2"/>
+      <w:r>
+        <w:t xml:space="preserve">Số nhà 13, Thôn 4, Xã Hòa Lạc, Hà Nội </w:t>
+      </w:r>
+      <w:bookmarkEnd w:id="31002"/>
     </w:p>
     <w:p>
       <w:pPr>
@@ -1139,161 +638,15 @@
         </w:rPr>
       </w:pPr>
       <w:r>
-        <w:rPr>
-          <w:rFonts w:eastAsia="Times New Roman"/>
-          <w:color w:val="000000"/>
-          <w:sz w:val="25"/>
-          <w:szCs w:val="25"/>
-          <w:lang w:val="vi-VN" w:eastAsia="zh-CN"/>
-        </w:rPr>
-        <w:t>Điện thoại:</w:t>
-      </w:r>
-      <w:r>
-        <w:rPr>
-          <w:rFonts w:eastAsia="Times New Roman"/>
-          <w:color w:val="000000"/>
-          <w:sz w:val="25"/>
-          <w:szCs w:val="25"/>
-          <w:lang w:val="vi-VN" w:eastAsia="zh-CN"/>
-        </w:rPr>
-        <w:t xml:space="preserve"> </w:t>
-      </w:r>
-      <w:r>
-        <w:rPr>
-          <w:rFonts w:eastAsia="Times New Roman"/>
-          <w:color w:val="000000"/>
-          <w:sz w:val="25"/>
-          <w:szCs w:val="25"/>
-          <w:lang w:val="vi-VN" w:eastAsia="zh-CN"/>
-        </w:rPr>
-        <w:t>[</w:t>
-      </w:r>
-      <w:r>
-        <w:rPr>
-          <w:sz w:val="26"/>
-          <w:szCs w:val="26"/>
-          <w:highlight w:val="yellow"/>
-          <w:lang w:val="vi-VN"/>
-        </w:rPr>
-        <w:t>0987654321</w:t>
-      </w:r>
-      <w:r>
-        <w:rPr>
-          <w:sz w:val="26"/>
-          <w:szCs w:val="26"/>
-          <w:lang w:val="vi-VN"/>
-        </w:rPr>
-        <w:t>]</w:t>
-      </w:r>
-      <w:r>
-        <w:rPr>
-          <w:rFonts w:eastAsia="Times New Roman"/>
-          <w:color w:val="000000"/>
-          <w:sz w:val="25"/>
-          <w:szCs w:val="25"/>
-          <w:lang w:val="vi-VN" w:eastAsia="zh-CN"/>
-        </w:rPr>
-        <w:t xml:space="preserve">              </w:t>
-      </w:r>
-      <w:r>
-        <w:rPr>
-          <w:rFonts w:eastAsia="Times New Roman"/>
-          <w:color w:val="000000"/>
-          <w:sz w:val="25"/>
-          <w:szCs w:val="25"/>
-          <w:lang w:val="vi-VN" w:eastAsia="zh-CN"/>
-        </w:rPr>
-        <w:t xml:space="preserve">    </w:t>
-      </w:r>
-      <w:r>
-        <w:rPr>
-          <w:rFonts w:eastAsia="Times New Roman"/>
-          <w:color w:val="000000"/>
-          <w:sz w:val="25"/>
-          <w:szCs w:val="25"/>
-          <w:lang w:val="vi-VN" w:eastAsia="zh-CN"/>
-        </w:rPr>
-        <w:t xml:space="preserve">  </w:t>
-      </w:r>
-      <w:r>
-        <w:rPr>
-          <w:rFonts w:eastAsia="Times New Roman"/>
-          <w:color w:val="000000"/>
-          <w:sz w:val="25"/>
-          <w:szCs w:val="25"/>
-          <w:lang w:val="vi-VN" w:eastAsia="zh-CN"/>
-        </w:rPr>
-        <w:t xml:space="preserve">  </w:t>
-      </w:r>
-      <w:r>
-        <w:rPr>
-          <w:rFonts w:eastAsia="Times New Roman"/>
-          <w:color w:val="000000"/>
-          <w:sz w:val="25"/>
-          <w:szCs w:val="25"/>
-          <w:lang w:val="vi-VN" w:eastAsia="zh-CN"/>
-        </w:rPr>
-        <w:t xml:space="preserve">  </w:t>
-      </w:r>
-      <w:r>
-        <w:rPr>
-          <w:rFonts w:eastAsia="Times New Roman"/>
-          <w:color w:val="000000"/>
-          <w:sz w:val="25"/>
-          <w:szCs w:val="25"/>
-          <w:lang w:val="vi-VN" w:eastAsia="zh-CN"/>
-        </w:rPr>
-        <w:t xml:space="preserve"> </w:t>
-      </w:r>
-      <w:r>
-        <w:rPr>
-          <w:rFonts w:eastAsia="Times New Roman"/>
-          <w:color w:val="000000"/>
-          <w:sz w:val="25"/>
-          <w:szCs w:val="25"/>
-          <w:lang w:val="vi-VN" w:eastAsia="zh-CN"/>
-        </w:rPr>
-        <w:t xml:space="preserve">  </w:t>
-      </w:r>
-      <w:r>
-        <w:rPr>
-          <w:rFonts w:eastAsia="Times New Roman"/>
-          <w:color w:val="000000"/>
-          <w:sz w:val="25"/>
-          <w:szCs w:val="25"/>
-          <w:lang w:val="vi-VN" w:eastAsia="zh-CN"/>
-        </w:rPr>
-        <w:t xml:space="preserve"> </w:t>
-      </w:r>
-      <w:r>
-        <w:rPr>
-          <w:rFonts w:eastAsia="Times New Roman"/>
-          <w:color w:val="000000"/>
-          <w:sz w:val="25"/>
-          <w:szCs w:val="25"/>
-          <w:lang w:val="vi-VN" w:eastAsia="zh-CN"/>
-        </w:rPr>
-        <w:t xml:space="preserve">  </w:t>
-      </w:r>
-      <w:r>
-        <w:rPr>
-          <w:rFonts w:eastAsia="Times New Roman"/>
-          <w:color w:val="000000"/>
-          <w:sz w:val="25"/>
-          <w:szCs w:val="25"/>
-          <w:lang w:val="vi-VN" w:eastAsia="zh-CN"/>
-        </w:rPr>
-        <w:t xml:space="preserve">Fax (nếu có): </w:t>
-      </w:r>
-      <w:r>
-        <w:rPr>
-          <w:rFonts w:eastAsia="Times New Roman"/>
-          <w:color w:val="000000"/>
-          <w:sz w:val="25"/>
-          <w:szCs w:val="25"/>
-          <w:lang w:val="vi-VN" w:eastAsia="zh-CN"/>
-        </w:rPr>
-        <w:tab/>
+        <w:t xml:space="preserve">Điện thoại: </w:t>
+      </w:r>
+      <w:bookmarkStart w:id="31003" w:name="MINGO_FIELD_3"/>
+      <w:r>
+        <w:t xml:space="preserve">0987654321</w:t>
+      </w:r>
+      <w:bookmarkEnd w:id="31003"/>
+      <w:r>
+        <w:t xml:space="preserve">                              Fax (nếu có): </w:t>
       </w:r>
     </w:p>
     <w:p>
@@ -1760,7 +1113,7 @@
                 <w:szCs w:val="26"/>
                 <w:lang w:val="vi-VN"/>
               </w:rPr>
-              <w:t>[</w:t>
+              <w:t/>
             </w:r>
             <w:r>
               <w:rPr>
@@ -1802,7 +1155,7 @@
                 <w:szCs w:val="26"/>
                 <w:lang w:val="vi-VN"/>
               </w:rPr>
-              <w:t>]</w:t>
+              <w:t/>
             </w:r>
           </w:p>
         </w:tc>
@@ -1822,30 +1175,11 @@
                 <w:lang w:val="vi-VN"/>
               </w:rPr>
             </w:pPr>
+            <w:bookmarkStart w:id="31004" w:name="MINGO_FIELD_4"/>
             <w:r>
-              <w:rPr>
-                <w:sz w:val="26"/>
-                <w:szCs w:val="26"/>
-                <w:lang w:val="vi-VN"/>
-              </w:rPr>
-              <w:t>[</w:t>
+              <w:t xml:space="preserve">4610</w:t>
             </w:r>
-            <w:r>
-              <w:rPr>
-                <w:sz w:val="26"/>
-                <w:szCs w:val="26"/>
-                <w:lang w:val="en-US"/>
-              </w:rPr>
-              <w:t>4610</w:t>
-            </w:r>
-            <w:r>
-              <w:rPr>
-                <w:sz w:val="26"/>
-                <w:szCs w:val="26"/>
-                <w:lang w:val="vi-VN"/>
-              </w:rPr>
-              <w:t>]</w:t>
-            </w:r>
+            <w:bookmarkEnd w:id="31004"/>
           </w:p>
         </w:tc>
         <w:tc>
@@ -1916,7 +1250,7 @@
                 <w:szCs w:val="26"/>
                 <w:lang w:val="vi-VN"/>
               </w:rPr>
-              <w:t>[</w:t>
+              <w:t/>
             </w:r>
             <w:r>
               <w:rPr>
@@ -1989,7 +1323,7 @@
                 <w:szCs w:val="26"/>
                 <w:lang w:val="vi-VN"/>
               </w:rPr>
-              <w:t>]</w:t>
+              <w:t/>
             </w:r>
           </w:p>
         </w:tc>
@@ -2011,36 +1345,11 @@
                 <w:lang w:val="vi-VN"/>
               </w:rPr>
             </w:pPr>
+            <w:bookmarkStart w:id="31005" w:name="MINGO_FIELD_5"/>
             <w:r>
-              <w:rPr>
-                <w:b/>
-                <w:bCs/>
-                <w:sz w:val="26"/>
-                <w:szCs w:val="26"/>
-                <w:lang w:val="vi-VN"/>
-              </w:rPr>
-              <w:t>[</w:t>
+              <w:t xml:space="preserve">5229</w:t>
             </w:r>
-            <w:r>
-              <w:rPr>
-                <w:b/>
-                <w:bCs/>
-                <w:sz w:val="26"/>
-                <w:szCs w:val="26"/>
-                <w:lang w:val="en-US"/>
-              </w:rPr>
-              <w:t>5229</w:t>
-            </w:r>
-            <w:r>
-              <w:rPr>
-                <w:b/>
-                <w:bCs/>
-                <w:sz w:val="26"/>
-                <w:szCs w:val="26"/>
-                <w:lang w:val="vi-VN"/>
-              </w:rPr>
-              <w:t>]</w:t>
-            </w:r>
+            <w:bookmarkEnd w:id="31005"/>
           </w:p>
         </w:tc>
         <w:tc>
@@ -2116,45 +1425,11 @@
                 <w:lang w:val="vi-VN"/>
               </w:rPr>
             </w:pPr>
+            <w:bookmarkStart w:id="31006" w:name="MINGO_FIELD_6"/>
             <w:r>
-              <w:rPr>
-                <w:sz w:val="26"/>
-                <w:szCs w:val="26"/>
-                <w:lang w:val="vi-VN"/>
-              </w:rPr>
-              <w:t>[</w:t>
+              <w:t xml:space="preserve">Hoạt động tư vấn quản lý kinh doanh và hoạt động tư vấn quản lý khác (trừ tư vấn tài chính, kế toán, pháp luật)</w:t>
             </w:r>
-            <w:r>
-              <w:rPr>
-                <w:sz w:val="26"/>
-                <w:szCs w:val="26"/>
-              </w:rPr>
-              <w:t>Hoạt động tư vấn quản lý kinh doanh và hoạt động tư vấn quản lý khác</w:t>
-            </w:r>
-            <w:r>
-              <w:rPr>
-                <w:sz w:val="26"/>
-                <w:szCs w:val="26"/>
-              </w:rPr>
-              <w:t xml:space="preserve"> </w:t>
-            </w:r>
-            <w:r>
-              <w:rPr>
-                <w:rFonts w:eastAsia="Times New Roman"/>
-                <w:sz w:val="26"/>
-                <w:szCs w:val="26"/>
-              </w:rPr>
-              <w:t>(trừ tư vấn tài chính, kế toán, pháp luật)</w:t>
-            </w:r>
-            <w:r>
-              <w:rPr>
-                <w:rFonts w:eastAsia="Times New Roman"/>
-                <w:sz w:val="26"/>
-                <w:szCs w:val="26"/>
-                <w:lang w:val="vi-VN"/>
-              </w:rPr>
-              <w:t>]</w:t>
-            </w:r>
+            <w:bookmarkEnd w:id="31006"/>
           </w:p>
         </w:tc>
         <w:tc>
@@ -2173,30 +1448,11 @@
                 <w:lang w:val="vi-VN"/>
               </w:rPr>
             </w:pPr>
+            <w:bookmarkStart w:id="31007" w:name="MINGO_FIELD_7"/>
             <w:r>
-              <w:rPr>
-                <w:sz w:val="26"/>
-                <w:szCs w:val="26"/>
-                <w:lang w:val="vi-VN"/>
-              </w:rPr>
-              <w:t>[</w:t>
+              <w:t xml:space="preserve">7020</w:t>
             </w:r>
-            <w:r>
-              <w:rPr>
-                <w:sz w:val="26"/>
-                <w:szCs w:val="26"/>
-                <w:lang w:val="en-US"/>
-              </w:rPr>
-              <w:t>7020</w:t>
-            </w:r>
-            <w:r>
-              <w:rPr>
-                <w:sz w:val="26"/>
-                <w:szCs w:val="26"/>
-                <w:lang w:val="vi-VN"/>
-              </w:rPr>
-              <w:t>]</w:t>
-            </w:r>
+            <w:bookmarkEnd w:id="31007"/>
           </w:p>
         </w:tc>
         <w:tc>
@@ -2265,7 +1521,7 @@
                 <w:szCs w:val="26"/>
                 <w:lang w:val="vi-VN"/>
               </w:rPr>
-              <w:t>[</w:t>
+              <w:t/>
             </w:r>
             <w:r>
               <w:rPr>
@@ -2317,7 +1573,7 @@
                 <w:szCs w:val="26"/>
                 <w:lang w:val="vi-VN"/>
               </w:rPr>
-              <w:t>]</w:t>
+              <w:t/>
             </w:r>
           </w:p>
         </w:tc>
@@ -2337,30 +1593,11 @@
                 <w:lang w:val="vi-VN"/>
               </w:rPr>
             </w:pPr>
+            <w:bookmarkStart w:id="31008" w:name="MINGO_FIELD_8"/>
             <w:r>
-              <w:rPr>
-                <w:sz w:val="26"/>
-                <w:szCs w:val="26"/>
-                <w:lang w:val="vi-VN"/>
-              </w:rPr>
-              <w:t>[</w:t>
+              <w:t xml:space="preserve">7310</w:t>
             </w:r>
-            <w:r>
-              <w:rPr>
-                <w:sz w:val="26"/>
-                <w:szCs w:val="26"/>
-                <w:lang w:val="en-US"/>
-              </w:rPr>
-              <w:t>7310</w:t>
-            </w:r>
-            <w:r>
-              <w:rPr>
-                <w:sz w:val="26"/>
-                <w:szCs w:val="26"/>
-                <w:lang w:val="vi-VN"/>
-              </w:rPr>
-              <w:t>]</w:t>
-            </w:r>
+            <w:bookmarkEnd w:id="31008"/>
           </w:p>
         </w:tc>
         <w:tc>
@@ -2433,49 +1670,75 @@
         </w:rPr>
       </w:pPr>
       <w:r>
+        <w:t xml:space="preserve">Họ, chữ đệm và tên: </w:t>
+      </w:r>
+      <w:bookmarkStart w:id="31009" w:name="MINGO_FIELD_9"/>
+      <w:r>
+        <w:t xml:space="preserve">NGUYỄN THANH HÓA</w:t>
+      </w:r>
+      <w:bookmarkEnd w:id="31009"/>
+    </w:p>
+    <w:p>
+      <w:pPr>
+        <w:spacing w:line="312" w:lineRule="auto"/>
         <w:rPr>
           <w:sz w:val="25"/>
           <w:szCs w:val="25"/>
           <w:lang w:val="vi-VN"/>
         </w:rPr>
-        <w:t xml:space="preserve">Họ, chữ đệm và tên: </w:t>
-      </w:r>
-      <w:r>
+      </w:pPr>
+      <w:r>
+        <w:t xml:space="preserve">Ngày, tháng, năm sinh: </w:t>
+      </w:r>
+      <w:bookmarkStart w:id="31010" w:name="MINGO_FIELD_10"/>
+      <w:r>
+        <w:t xml:space="preserve">12/07/1977</w:t>
+      </w:r>
+      <w:bookmarkEnd w:id="31010"/>
+    </w:p>
+    <w:p>
+      <w:pPr>
+        <w:spacing w:line="312" w:lineRule="auto"/>
         <w:rPr>
           <w:sz w:val="25"/>
           <w:szCs w:val="25"/>
           <w:lang w:val="vi-VN"/>
         </w:rPr>
-        <w:t>[</w:t>
-      </w:r>
-      <w:r>
+      </w:pPr>
+      <w:r>
+        <w:t xml:space="preserve">Giới tính: </w:t>
+      </w:r>
+      <w:bookmarkStart w:id="31011" w:name="MINGO_FIELD_11"/>
+      <w:r>
+        <w:t xml:space="preserve">Nữ</w:t>
+      </w:r>
+      <w:bookmarkEnd w:id="31011"/>
+    </w:p>
+    <w:p>
+      <w:pPr>
+        <w:spacing w:line="312" w:lineRule="auto"/>
+        <w:jc w:val="both"/>
         <w:rPr>
           <w:rFonts w:eastAsia="Times New Roman"/>
-          <w:b/>
-          <w:bCs/>
-          <w:color w:val="000000"/>
-          <w:sz w:val="26"/>
-          <w:szCs w:val="26"/>
+          <w:color w:val="000000"/>
+          <w:sz w:val="25"/>
+          <w:szCs w:val="25"/>
           <w:lang w:val="vi-VN" w:eastAsia="zh-CN"/>
         </w:rPr>
-        <w:t xml:space="preserve">NGUYỄN THANH </w:t>
-      </w:r>
-      <w:r>
-        <w:rPr>
-          <w:rFonts w:eastAsia="Times New Roman"/>
-          <w:b/>
-          <w:bCs/>
-          <w:color w:val="000000"/>
-          <w:sz w:val="26"/>
-          <w:szCs w:val="26"/>
-          <w:lang w:val="vi-VN" w:eastAsia="zh-CN"/>
-        </w:rPr>
-        <w:t>HÓA]</w:t>
-      </w:r>
-    </w:p>
-    <w:p>
-      <w:pPr>
-        <w:spacing w:line="312" w:lineRule="auto"/>
+      </w:pPr>
+      <w:r>
+        <w:t xml:space="preserve">Số định danh cá nhân: </w:t>
+      </w:r>
+      <w:bookmarkStart w:id="31012" w:name="MINGO_FIELD_12"/>
+      <w:r>
+        <w:t xml:space="preserve">080177011933</w:t>
+      </w:r>
+      <w:bookmarkEnd w:id="31012"/>
+    </w:p>
+    <w:p>
+      <w:pPr>
+        <w:spacing w:line="312" w:lineRule="auto"/>
+        <w:jc w:val="both"/>
         <w:rPr>
           <w:sz w:val="25"/>
           <w:szCs w:val="25"/>
@@ -2483,485 +1746,115 @@
         </w:rPr>
       </w:pPr>
       <w:r>
+        <w:t xml:space="preserve">Địa chỉ thường trú: </w:t>
+      </w:r>
+      <w:bookmarkStart w:id="31013" w:name="MINGO_FIELD_13"/>
+      <w:r>
+        <w:t xml:space="preserve">Ấp Hậu Quới, Hậu Mỹ, Đồng Tháp</w:t>
+      </w:r>
+      <w:bookmarkEnd w:id="31013"/>
+    </w:p>
+    <w:p>
+      <w:pPr>
+        <w:spacing w:line="312" w:lineRule="auto"/>
+        <w:jc w:val="both"/>
         <w:rPr>
           <w:sz w:val="25"/>
           <w:szCs w:val="25"/>
           <w:lang w:val="vi-VN"/>
         </w:rPr>
-        <w:t xml:space="preserve">Ngày, tháng, năm sinh: </w:t>
-      </w:r>
-      <w:r>
-        <w:rPr>
+      </w:pPr>
+      <w:r>
+        <w:t xml:space="preserve">Địa chỉ liên lạc: </w:t>
+      </w:r>
+      <w:bookmarkStart w:id="31014" w:name="MINGO_FIELD_14"/>
+      <w:r>
+        <w:t xml:space="preserve">Ấp Hậu Quới, Hậu Mỹ, Đồng Tháp</w:t>
+      </w:r>
+      <w:bookmarkEnd w:id="31014"/>
+    </w:p>
+    <w:p>
+      <w:pPr>
+        <w:spacing w:line="312" w:lineRule="auto"/>
+        <w:jc w:val="both"/>
+        <w:rPr>
+          <w:b/>
+          <w:color w:val="000000"/>
           <w:sz w:val="25"/>
           <w:szCs w:val="25"/>
           <w:lang w:val="vi-VN"/>
         </w:rPr>
-        <w:t>[</w:t>
-      </w:r>
-      <w:r>
-        <w:rPr>
-          <w:rFonts w:eastAsia="Times New Roman"/>
-          <w:sz w:val="26"/>
-          <w:szCs w:val="26"/>
+      </w:pPr>
+      <w:r>
+        <w:rPr>
+          <w:b/>
+          <w:color w:val="000000"/>
+          <w:sz w:val="25"/>
+          <w:szCs w:val="25"/>
           <w:lang w:val="vi-VN"/>
         </w:rPr>
-        <w:t>12/07/</w:t>
-      </w:r>
-      <w:r>
-        <w:rPr>
-          <w:rFonts w:eastAsia="Times New Roman"/>
-          <w:sz w:val="26"/>
-          <w:szCs w:val="26"/>
+        <w:t>ĐIỀU 5: VỐN ĐIỀU LỆ VÀ VIỆC TĂNG GIẢM VỐN ĐIỀU LỆ</w:t>
+      </w:r>
+    </w:p>
+    <w:p>
+      <w:pPr>
+        <w:spacing w:line="312" w:lineRule="auto"/>
+        <w:jc w:val="both"/>
+        <w:rPr>
+          <w:color w:val="000000"/>
+          <w:sz w:val="25"/>
+          <w:szCs w:val="25"/>
           <w:lang w:val="vi-VN"/>
         </w:rPr>
-        <w:t>1977]</w:t>
-      </w:r>
-    </w:p>
-    <w:p>
-      <w:pPr>
-        <w:spacing w:line="312" w:lineRule="auto"/>
-        <w:rPr>
+      </w:pPr>
+      <w:r>
+        <w:t xml:space="preserve">5.1. Vốn điều lệ:</w:t>
+      </w:r>
+      <w:bookmarkStart w:id="31015" w:name="MINGO_FIELD_15"/>
+      <w:r>
+        <w:t xml:space="preserve"> 3.000.000.000 đồng (Ba tỷ đồng)</w:t>
+      </w:r>
+      <w:bookmarkEnd w:id="31015"/>
+    </w:p>
+    <w:p>
+      <w:pPr>
+        <w:spacing w:line="312" w:lineRule="auto"/>
+        <w:jc w:val="both"/>
+        <w:rPr>
+          <w:color w:val="000000"/>
           <w:sz w:val="25"/>
           <w:szCs w:val="25"/>
           <w:lang w:val="vi-VN"/>
         </w:rPr>
       </w:pPr>
       <w:r>
-        <w:rPr>
+        <w:t xml:space="preserve">Vốn bằng tài sản:</w:t>
+      </w:r>
+      <w:bookmarkStart w:id="31016" w:name="MINGO_FIELD_16"/>
+      <w:r>
+        <w:t xml:space="preserve">(không có)</w:t>
+      </w:r>
+      <w:bookmarkEnd w:id="31016"/>
+    </w:p>
+    <w:p>
+      <w:pPr>
+        <w:spacing w:line="312" w:lineRule="auto"/>
+        <w:jc w:val="both"/>
+        <w:rPr>
+          <w:color w:val="000000"/>
           <w:sz w:val="25"/>
           <w:szCs w:val="25"/>
           <w:lang w:val="vi-VN"/>
         </w:rPr>
-        <w:t xml:space="preserve">Giới </w:t>
-      </w:r>
-      <w:r>
-        <w:rPr>
-          <w:sz w:val="25"/>
-          <w:szCs w:val="25"/>
-          <w:lang w:val="vi-VN"/>
-        </w:rPr>
-        <w:t xml:space="preserve">tính: </w:t>
-      </w:r>
-      <w:r>
-        <w:rPr>
-          <w:sz w:val="25"/>
-          <w:szCs w:val="25"/>
-          <w:lang w:val="vi-VN"/>
-        </w:rPr>
-        <w:t>[Nữ]</w:t>
-      </w:r>
-    </w:p>
-    <w:p>
-      <w:pPr>
-        <w:spacing w:line="312" w:lineRule="auto"/>
-        <w:jc w:val="both"/>
-        <w:rPr>
-          <w:rFonts w:eastAsia="Times New Roman"/>
-          <w:color w:val="000000"/>
-          <w:sz w:val="25"/>
-          <w:szCs w:val="25"/>
-          <w:lang w:val="vi-VN" w:eastAsia="zh-CN"/>
-        </w:rPr>
-      </w:pPr>
-      <w:r>
-        <w:rPr>
-          <w:sz w:val="25"/>
-          <w:szCs w:val="25"/>
-          <w:lang w:val="vi-VN"/>
-        </w:rPr>
-        <w:t xml:space="preserve">Số định danh cá nhân: </w:t>
-      </w:r>
-      <w:r>
-        <w:rPr>
-          <w:sz w:val="25"/>
-          <w:szCs w:val="25"/>
-          <w:lang w:val="vi-VN"/>
-        </w:rPr>
-        <w:t>[</w:t>
-      </w:r>
-      <w:r>
-        <w:rPr>
-          <w:rFonts w:eastAsia="Times New Roman"/>
-          <w:sz w:val="26"/>
-          <w:szCs w:val="26"/>
-          <w:lang w:val="vi-VN"/>
-        </w:rPr>
-        <w:t>08</w:t>
-      </w:r>
-      <w:r>
-        <w:rPr>
-          <w:rFonts w:eastAsia="Times New Roman"/>
-          <w:sz w:val="26"/>
-          <w:szCs w:val="26"/>
-          <w:lang w:val="vi-VN"/>
-        </w:rPr>
-        <w:t>0177011933]</w:t>
-      </w:r>
-    </w:p>
-    <w:p>
-      <w:pPr>
-        <w:spacing w:line="312" w:lineRule="auto"/>
-        <w:jc w:val="both"/>
-        <w:rPr>
-          <w:sz w:val="25"/>
-          <w:szCs w:val="25"/>
-          <w:lang w:val="vi-VN"/>
-        </w:rPr>
-      </w:pPr>
-      <w:r>
-        <w:rPr>
-          <w:sz w:val="25"/>
-          <w:szCs w:val="25"/>
-          <w:lang w:val="vi-VN"/>
-        </w:rPr>
-        <w:t xml:space="preserve">Địa chỉ thường trú: </w:t>
-      </w:r>
-      <w:r>
-        <w:rPr>
-          <w:sz w:val="25"/>
-          <w:szCs w:val="25"/>
-          <w:lang w:val="vi-VN"/>
-        </w:rPr>
-        <w:t>[</w:t>
-      </w:r>
-      <w:r>
-        <w:rPr>
-          <w:rFonts w:eastAsia="Times New Roman"/>
-          <w:sz w:val="26"/>
-          <w:szCs w:val="26"/>
-          <w:lang w:val="vi-VN"/>
-        </w:rPr>
-        <w:t xml:space="preserve">Ấp Hậu Quới, Hậu Mỹ, Đồng </w:t>
-      </w:r>
-      <w:r>
-        <w:rPr>
-          <w:rFonts w:eastAsia="Times New Roman"/>
-          <w:sz w:val="26"/>
-          <w:szCs w:val="26"/>
-          <w:lang w:val="vi-VN"/>
-        </w:rPr>
-        <w:t>Tháp]</w:t>
-      </w:r>
-    </w:p>
-    <w:p>
-      <w:pPr>
-        <w:spacing w:line="312" w:lineRule="auto"/>
-        <w:jc w:val="both"/>
-        <w:rPr>
-          <w:sz w:val="25"/>
-          <w:szCs w:val="25"/>
-          <w:lang w:val="vi-VN"/>
-        </w:rPr>
-      </w:pPr>
-      <w:r>
-        <w:rPr>
-          <w:sz w:val="25"/>
-          <w:szCs w:val="25"/>
-          <w:lang w:val="vi-VN"/>
-        </w:rPr>
-        <w:t xml:space="preserve">Địa chỉ liên lạc: </w:t>
-      </w:r>
-      <w:r>
-        <w:rPr>
-          <w:sz w:val="25"/>
-          <w:szCs w:val="25"/>
-          <w:lang w:val="vi-VN"/>
-        </w:rPr>
-        <w:t>[</w:t>
-      </w:r>
-      <w:r>
-        <w:rPr>
-          <w:rFonts w:eastAsia="Times New Roman"/>
-          <w:sz w:val="26"/>
-          <w:szCs w:val="26"/>
-          <w:lang w:val="vi-VN"/>
-        </w:rPr>
-        <w:t xml:space="preserve">Ấp Hậu Quới, Hậu Mỹ, Đồng </w:t>
-      </w:r>
-      <w:r>
-        <w:rPr>
-          <w:rFonts w:eastAsia="Times New Roman"/>
-          <w:sz w:val="26"/>
-          <w:szCs w:val="26"/>
-          <w:lang w:val="vi-VN"/>
-        </w:rPr>
-        <w:t>Tháp]</w:t>
-      </w:r>
-    </w:p>
-    <w:p>
-      <w:pPr>
-        <w:spacing w:line="312" w:lineRule="auto"/>
-        <w:jc w:val="both"/>
-        <w:rPr>
-          <w:b/>
-          <w:color w:val="000000"/>
-          <w:sz w:val="25"/>
-          <w:szCs w:val="25"/>
-          <w:lang w:val="vi-VN"/>
-        </w:rPr>
-      </w:pPr>
-      <w:r>
-        <w:rPr>
-          <w:b/>
-          <w:color w:val="000000"/>
-          <w:sz w:val="25"/>
-          <w:szCs w:val="25"/>
-          <w:lang w:val="vi-VN"/>
-        </w:rPr>
-        <w:t>ĐIỀU 5: VỐN ĐIỀU LỆ VÀ VIỆC TĂNG GIẢM VỐN ĐIỀU LỆ</w:t>
-      </w:r>
-    </w:p>
-    <w:p>
-      <w:pPr>
-        <w:spacing w:line="312" w:lineRule="auto"/>
-        <w:jc w:val="both"/>
-        <w:rPr>
-          <w:color w:val="000000"/>
-          <w:sz w:val="25"/>
-          <w:szCs w:val="25"/>
-          <w:lang w:val="vi-VN"/>
-        </w:rPr>
-      </w:pPr>
-      <w:r>
-        <w:rPr>
-          <w:color w:val="000000"/>
-          <w:sz w:val="25"/>
-          <w:szCs w:val="25"/>
-          <w:lang w:val="vi-VN"/>
-        </w:rPr>
-        <w:t>5.1. Vốn điều lệ:</w:t>
-      </w:r>
-      <w:r>
-        <w:rPr>
-          <w:color w:val="000000"/>
-          <w:sz w:val="25"/>
-          <w:szCs w:val="25"/>
-          <w:lang w:val="vi-VN"/>
-        </w:rPr>
-        <w:tab/>
-      </w:r>
-      <w:r>
-        <w:rPr>
-          <w:color w:val="000000"/>
-          <w:sz w:val="25"/>
-          <w:szCs w:val="25"/>
-          <w:lang w:val="vi-VN"/>
-        </w:rPr>
-        <w:t>[</w:t>
-      </w:r>
-      <w:r>
-        <w:rPr>
-          <w:color w:val="000000"/>
-          <w:sz w:val="25"/>
-          <w:szCs w:val="25"/>
-          <w:lang w:val="vi-VN"/>
-        </w:rPr>
-        <w:t xml:space="preserve"> </w:t>
-      </w:r>
-      <w:r>
-        <w:rPr>
-          <w:color w:val="000000"/>
-          <w:sz w:val="25"/>
-          <w:szCs w:val="25"/>
-          <w:highlight w:val="yellow"/>
-          <w:lang w:val="vi-VN"/>
-        </w:rPr>
-        <w:t>3.00</w:t>
-      </w:r>
-      <w:r>
-        <w:rPr>
-          <w:color w:val="000000"/>
-          <w:sz w:val="25"/>
-          <w:szCs w:val="25"/>
-          <w:highlight w:val="yellow"/>
-          <w:lang w:val="vi-VN"/>
-        </w:rPr>
-        <w:t>0</w:t>
-      </w:r>
-      <w:r>
-        <w:rPr>
-          <w:color w:val="000000"/>
-          <w:sz w:val="25"/>
-          <w:szCs w:val="25"/>
-          <w:highlight w:val="yellow"/>
-          <w:lang w:val="vi-VN"/>
-        </w:rPr>
-        <w:t>.000.000 đồng (</w:t>
-      </w:r>
-      <w:r>
-        <w:rPr>
-          <w:color w:val="000000"/>
-          <w:sz w:val="25"/>
-          <w:szCs w:val="25"/>
-          <w:highlight w:val="yellow"/>
-          <w:lang w:val="vi-VN"/>
-        </w:rPr>
-        <w:t xml:space="preserve">Ba tỷ </w:t>
-      </w:r>
-      <w:r>
-        <w:rPr>
-          <w:color w:val="000000"/>
-          <w:sz w:val="25"/>
-          <w:szCs w:val="25"/>
-          <w:highlight w:val="yellow"/>
-          <w:lang w:val="vi-VN"/>
-        </w:rPr>
-        <w:t>đồng)</w:t>
-      </w:r>
-      <w:r>
-        <w:rPr>
-          <w:color w:val="000000"/>
-          <w:sz w:val="25"/>
-          <w:szCs w:val="25"/>
-          <w:lang w:val="vi-VN"/>
-        </w:rPr>
-        <w:t>]</w:t>
-      </w:r>
-    </w:p>
-    <w:p>
-      <w:pPr>
-        <w:spacing w:line="312" w:lineRule="auto"/>
-        <w:jc w:val="both"/>
-        <w:rPr>
-          <w:color w:val="000000"/>
-          <w:sz w:val="25"/>
-          <w:szCs w:val="25"/>
-          <w:lang w:val="vi-VN"/>
-        </w:rPr>
-      </w:pPr>
-      <w:r>
-        <w:rPr>
-          <w:color w:val="000000"/>
-          <w:sz w:val="25"/>
-          <w:szCs w:val="25"/>
-          <w:lang w:val="vi-VN"/>
-        </w:rPr>
-        <w:t>Vốn bằng tài sản:</w:t>
-      </w:r>
-      <w:r>
-        <w:rPr>
-          <w:color w:val="000000"/>
-          <w:sz w:val="25"/>
-          <w:szCs w:val="25"/>
-          <w:lang w:val="vi-VN"/>
-        </w:rPr>
-        <w:tab/>
-      </w:r>
-      <w:r>
-        <w:rPr>
-          <w:color w:val="000000"/>
-          <w:sz w:val="25"/>
-          <w:szCs w:val="25"/>
-          <w:lang w:val="vi-VN"/>
-        </w:rPr>
-        <w:t>[</w:t>
-      </w:r>
-      <w:r>
-        <w:rPr>
-          <w:color w:val="000000"/>
-          <w:sz w:val="25"/>
-          <w:szCs w:val="25"/>
-          <w:lang w:val="vi-VN"/>
-        </w:rPr>
-        <w:t>(không có)</w:t>
-      </w:r>
-      <w:r>
-        <w:rPr>
-          <w:color w:val="000000"/>
-          <w:sz w:val="25"/>
-          <w:szCs w:val="25"/>
-          <w:lang w:val="vi-VN"/>
-        </w:rPr>
-        <w:t>]</w:t>
-      </w:r>
-    </w:p>
-    <w:p>
-      <w:pPr>
-        <w:spacing w:line="312" w:lineRule="auto"/>
-        <w:jc w:val="both"/>
-        <w:rPr>
-          <w:color w:val="000000"/>
-          <w:sz w:val="25"/>
-          <w:szCs w:val="25"/>
-          <w:lang w:val="vi-VN"/>
-        </w:rPr>
-      </w:pPr>
-      <w:r>
-        <w:rPr>
-          <w:color w:val="000000"/>
-          <w:sz w:val="25"/>
-          <w:szCs w:val="25"/>
-          <w:lang w:val="vi-VN"/>
-        </w:rPr>
-        <w:t xml:space="preserve">Vốn bằng tiền mặt:   </w:t>
-      </w:r>
-      <w:r>
-        <w:rPr>
-          <w:color w:val="000000"/>
-          <w:sz w:val="25"/>
-          <w:szCs w:val="25"/>
-          <w:lang w:val="vi-VN"/>
-        </w:rPr>
-        <w:t xml:space="preserve"> </w:t>
-      </w:r>
-      <w:r>
-        <w:rPr>
-          <w:color w:val="000000"/>
-          <w:sz w:val="25"/>
-          <w:szCs w:val="25"/>
-          <w:lang w:val="vi-VN"/>
-        </w:rPr>
-        <w:t>[</w:t>
-      </w:r>
-      <w:r>
-        <w:rPr>
-          <w:color w:val="000000"/>
-          <w:sz w:val="25"/>
-          <w:szCs w:val="25"/>
-          <w:highlight w:val="yellow"/>
-          <w:lang w:val="vi-VN"/>
-        </w:rPr>
-        <w:t>3.00</w:t>
-      </w:r>
-      <w:r>
-        <w:rPr>
-          <w:color w:val="000000"/>
-          <w:sz w:val="25"/>
-          <w:szCs w:val="25"/>
-          <w:highlight w:val="yellow"/>
-          <w:lang w:val="vi-VN"/>
-        </w:rPr>
-        <w:t>0.000.000 đồng (</w:t>
-      </w:r>
-      <w:r>
-        <w:rPr>
-          <w:color w:val="000000"/>
-          <w:sz w:val="25"/>
-          <w:szCs w:val="25"/>
-          <w:highlight w:val="yellow"/>
-          <w:lang w:val="vi-VN"/>
-        </w:rPr>
-        <w:t xml:space="preserve">Ba tỷ </w:t>
-      </w:r>
-      <w:r>
-        <w:rPr>
-          <w:color w:val="000000"/>
-          <w:sz w:val="25"/>
-          <w:szCs w:val="25"/>
-          <w:highlight w:val="yellow"/>
-          <w:lang w:val="vi-VN"/>
-        </w:rPr>
-        <w:t>đồng)</w:t>
-      </w:r>
-      <w:r>
-        <w:rPr>
-          <w:color w:val="000000"/>
-          <w:sz w:val="25"/>
-          <w:szCs w:val="25"/>
-          <w:lang w:val="vi-VN"/>
-        </w:rPr>
-        <w:t>]</w:t>
-      </w:r>
+      </w:pPr>
+      <w:r>
+        <w:t xml:space="preserve">Vốn bằng tiền mặt:    </w:t>
+      </w:r>
+      <w:bookmarkStart w:id="31017" w:name="MINGO_FIELD_17"/>
+      <w:r>
+        <w:t xml:space="preserve">3.000.000.000 đồng (Ba tỷ đồng)</w:t>
+      </w:r>
+      <w:bookmarkEnd w:id="31017"/>
     </w:p>
     <w:p>
       <w:pPr>
@@ -7237,175 +6130,13 @@
         </w:rPr>
       </w:pPr>
       <w:r>
-        <w:rPr>
-          <w:color w:val="000000"/>
-          <w:sz w:val="25"/>
-          <w:szCs w:val="25"/>
-          <w:lang w:val="fr-FR"/>
-        </w:rPr>
-        <w:t xml:space="preserve">25.1. </w:t>
-      </w:r>
-      <w:r>
-        <w:rPr>
-          <w:color w:val="000000"/>
-          <w:sz w:val="25"/>
-          <w:szCs w:val="25"/>
-          <w:lang w:val="fr-FR"/>
-        </w:rPr>
-        <w:t xml:space="preserve">Điều lệ này được lập thành 5 </w:t>
-      </w:r>
-      <w:r>
-        <w:rPr>
-          <w:color w:val="000000"/>
-          <w:sz w:val="25"/>
-          <w:szCs w:val="25"/>
-          <w:lang w:val="fr-FR"/>
-        </w:rPr>
-        <w:t>C</w:t>
-      </w:r>
-      <w:r>
-        <w:rPr>
-          <w:color w:val="000000"/>
-          <w:sz w:val="25"/>
-          <w:szCs w:val="25"/>
-          <w:lang w:val="fr-FR"/>
-        </w:rPr>
-        <w:t xml:space="preserve">hương, 25 </w:t>
-      </w:r>
-      <w:r>
-        <w:rPr>
-          <w:color w:val="000000"/>
-          <w:sz w:val="25"/>
-          <w:szCs w:val="25"/>
-          <w:lang w:val="fr-FR"/>
-        </w:rPr>
-        <w:t>Đ</w:t>
-      </w:r>
-      <w:r>
-        <w:rPr>
-          <w:color w:val="000000"/>
-          <w:sz w:val="25"/>
-          <w:szCs w:val="25"/>
-          <w:lang w:val="fr-FR"/>
-        </w:rPr>
-        <w:t>iều và được Chủ sở hữu Công ty</w:t>
-      </w:r>
-      <w:r>
-        <w:rPr>
-          <w:color w:val="000000"/>
-          <w:sz w:val="25"/>
-          <w:szCs w:val="25"/>
-          <w:lang w:val="fr-FR" w:eastAsia="ja-JP"/>
-        </w:rPr>
-        <w:t xml:space="preserve"> </w:t>
-      </w:r>
-      <w:r>
-        <w:rPr>
-          <w:color w:val="000000"/>
-          <w:sz w:val="25"/>
-          <w:szCs w:val="25"/>
-          <w:lang w:val="fr-FR"/>
-        </w:rPr>
-        <w:t xml:space="preserve">thông qua </w:t>
-      </w:r>
-      <w:r>
-        <w:rPr>
-          <w:color w:val="000000"/>
-          <w:sz w:val="25"/>
-          <w:szCs w:val="25"/>
-          <w:lang w:val="vi-VN"/>
-        </w:rPr>
-        <w:t>[</w:t>
-      </w:r>
-      <w:r>
-        <w:rPr>
-          <w:color w:val="000000"/>
-          <w:sz w:val="25"/>
-          <w:szCs w:val="25"/>
-          <w:highlight w:val="yellow"/>
-          <w:lang w:val="fr-FR"/>
-        </w:rPr>
-        <w:t xml:space="preserve">ngày </w:t>
-      </w:r>
-      <w:r>
-        <w:rPr>
-          <w:color w:val="000000"/>
-          <w:sz w:val="25"/>
-          <w:szCs w:val="25"/>
-          <w:highlight w:val="yellow"/>
-          <w:lang w:val="fr-FR"/>
-        </w:rPr>
-        <w:t>23</w:t>
-      </w:r>
-      <w:r>
-        <w:rPr>
-          <w:color w:val="000000"/>
-          <w:sz w:val="25"/>
-          <w:szCs w:val="25"/>
-          <w:highlight w:val="yellow"/>
-          <w:lang w:val="fr-FR"/>
-        </w:rPr>
-        <w:t xml:space="preserve"> </w:t>
-      </w:r>
-      <w:r>
-        <w:rPr>
-          <w:color w:val="000000"/>
-          <w:sz w:val="25"/>
-          <w:szCs w:val="25"/>
-          <w:highlight w:val="yellow"/>
-          <w:lang w:val="fr-FR"/>
-        </w:rPr>
-        <w:t>tháng 0</w:t>
-      </w:r>
-      <w:r>
-        <w:rPr>
-          <w:color w:val="000000"/>
-          <w:sz w:val="25"/>
-          <w:szCs w:val="25"/>
-          <w:highlight w:val="yellow"/>
-          <w:lang w:val="fr-FR"/>
-        </w:rPr>
-        <w:t>3</w:t>
-      </w:r>
-      <w:r>
-        <w:rPr>
-          <w:color w:val="000000"/>
-          <w:sz w:val="25"/>
-          <w:szCs w:val="25"/>
-          <w:highlight w:val="yellow"/>
-          <w:lang w:val="fr-FR"/>
-        </w:rPr>
-        <w:t xml:space="preserve"> năm 202</w:t>
-      </w:r>
-      <w:r>
-        <w:rPr>
-          <w:color w:val="000000"/>
-          <w:sz w:val="25"/>
-          <w:szCs w:val="25"/>
-          <w:highlight w:val="yellow"/>
-          <w:lang w:val="fr-FR"/>
-        </w:rPr>
-        <w:t>6</w:t>
-      </w:r>
-      <w:r>
-        <w:rPr>
-          <w:color w:val="000000"/>
-          <w:sz w:val="25"/>
-          <w:szCs w:val="25"/>
-          <w:highlight w:val="yellow"/>
-          <w:lang w:val="fr-FR"/>
-        </w:rPr>
-        <w:t>.</w:t>
-      </w:r>
-      <w:r>
-        <w:rPr>
-          <w:color w:val="000000"/>
-          <w:sz w:val="25"/>
-          <w:szCs w:val="25"/>
-          <w:lang w:val="vi-VN"/>
-        </w:rPr>
-        <w:t>]</w:t>
-      </w:r>
+        <w:t xml:space="preserve">25.1. Điều lệ này được lập thành 5 Chương, 25 Điều và được Chủ sở hữu Công ty thông qua </w:t>
+      </w:r>
+      <w:bookmarkStart w:id="31018" w:name="MINGO_FIELD_18"/>
+      <w:r>
+        <w:t xml:space="preserve">ngày 23 tháng 03 năm 2026.</w:t>
+      </w:r>
+      <w:bookmarkEnd w:id="31018"/>
     </w:p>
     <w:p>
       <w:pPr>
@@ -7558,15 +6289,11 @@
           <w:lang w:val="vi-VN"/>
         </w:rPr>
       </w:pPr>
-      <w:r>
-        <w:rPr>
-          <w:color w:val="000000"/>
-          <w:sz w:val="25"/>
-          <w:szCs w:val="25"/>
-          <w:lang w:val="vi-VN"/>
-        </w:rPr>
-        <w:t>[THOMAS EDITION]</w:t>
-      </w:r>
+      <w:bookmarkStart w:id="31019" w:name="MINGO_FIELD_19"/>
+      <w:r>
+        <w:t xml:space="preserve">THOMAS EDITION</w:t>
+      </w:r>
+      <w:bookmarkEnd w:id="31019"/>
     </w:p>
     <w:sectPr>
       <w:headerReference w:type="even" r:id="rId8"/>

</xml_diff>